<commit_message>
Add day-by-day timeline (md, docx, csv); fix weekday labels in master plan and README
Co-Authored-By: Claude Fable 5.1 <noreply@anthropic.com>
</commit_message>
<xml_diff>
--- a/docs/03-master-plan-31-days.docx
+++ b/docs/03-master-plan-31-days.docx
@@ -25,7 +25,7 @@
         <w:pStyle w:val="FirstParagraph"/>
       </w:pPr>
       <w:r>
-        <w:t xml:space="preserve">Prepared Tuesday October 7, 2026. Event Saturday November 7 to Sunday November 8.</w:t>
+        <w:t xml:space="preserve">Prepared Wednesday October 7, 2026. Event Saturday November 7 to Sunday November 8.</w:t>
       </w:r>
     </w:p>
     <w:p>
@@ -1187,7 +1187,7 @@
         <w:t xml:space="preserve"> </w:t>
       </w:r>
       <w:r>
-        <w:t xml:space="preserve">One 30-minute all-hands on Sunday evening with the gate status; team leads post a three-line update in the organizer chat every Wednesday. Decisions not made in those two places are made by the main organizers the same day.</w:t>
+        <w:t xml:space="preserve">One 30-minute all-hands on Sunday evening (Oct 11, 18, 25, Nov 1) with the gate status; team leads post a three-line update in the organizer chat every Wednesday. Decisions not made in those two places are made by the main organizers the same day.</w:t>
       </w:r>
     </w:p>
     <w:p>
@@ -1299,7 +1299,7 @@
               <w:pStyle w:val="Compact"/>
             </w:pPr>
             <w:r>
-              <w:t xml:space="preserve">Tue Oct 7</w:t>
+              <w:t xml:space="preserve">Wed Oct 7</w:t>
             </w:r>
           </w:p>
         </w:tc>
@@ -1334,7 +1334,7 @@
               <w:pStyle w:val="Compact"/>
             </w:pPr>
             <w:r>
-              <w:t xml:space="preserve">Wed Oct 8</w:t>
+              <w:t xml:space="preserve">Thu Oct 8</w:t>
             </w:r>
           </w:p>
         </w:tc>
@@ -1369,7 +1369,7 @@
               <w:pStyle w:val="Compact"/>
             </w:pPr>
             <w:r>
-              <w:t xml:space="preserve">Thu Oct 9</w:t>
+              <w:t xml:space="preserve">Fri Oct 9</w:t>
             </w:r>
           </w:p>
         </w:tc>
@@ -1404,7 +1404,7 @@
               <w:pStyle w:val="Compact"/>
             </w:pPr>
             <w:r>
-              <w:t xml:space="preserve">Fri Oct 10</w:t>
+              <w:t xml:space="preserve">Sat Oct 10</w:t>
             </w:r>
           </w:p>
         </w:tc>
@@ -1439,42 +1439,42 @@
               <w:pStyle w:val="Compact"/>
             </w:pPr>
             <w:r>
-              <w:t xml:space="preserve">Sat Oct 11</w:t>
-            </w:r>
-          </w:p>
-        </w:tc>
-        <w:tc>
-          <w:tcPr/>
-          <w:p>
-            <w:pPr>
-              <w:pStyle w:val="Compact"/>
-            </w:pPr>
-            <w:r>
-              <w:t xml:space="preserve">Publish rules, tracks and problem bank on the site.</w:t>
-            </w:r>
-          </w:p>
-        </w:tc>
-        <w:tc>
-          <w:tcPr/>
-          <w:p>
-            <w:pPr>
-              <w:pStyle w:val="Compact"/>
-            </w:pPr>
-            <w:r>
-              <w:t xml:space="preserve">O</w:t>
-            </w:r>
-          </w:p>
-        </w:tc>
-      </w:tr>
-      <w:tr>
-        <w:tc>
-          <w:tcPr/>
-          <w:p>
-            <w:pPr>
-              <w:pStyle w:val="Compact"/>
-            </w:pPr>
-            <w:r>
-              <w:t xml:space="preserve">Sun Oct 12</w:t>
+              <w:t xml:space="preserve">Sun Oct 11</w:t>
+            </w:r>
+          </w:p>
+        </w:tc>
+        <w:tc>
+          <w:tcPr/>
+          <w:p>
+            <w:pPr>
+              <w:pStyle w:val="Compact"/>
+            </w:pPr>
+            <w:r>
+              <w:t xml:space="preserve">Publish rules, tracks and problem bank on the site. All-hands 1.</w:t>
+            </w:r>
+          </w:p>
+        </w:tc>
+        <w:tc>
+          <w:tcPr/>
+          <w:p>
+            <w:pPr>
+              <w:pStyle w:val="Compact"/>
+            </w:pPr>
+            <w:r>
+              <w:t xml:space="preserve">O, M</w:t>
+            </w:r>
+          </w:p>
+        </w:tc>
+      </w:tr>
+      <w:tr>
+        <w:tc>
+          <w:tcPr/>
+          <w:p>
+            <w:pPr>
+              <w:pStyle w:val="Compact"/>
+            </w:pPr>
+            <w:r>
+              <w:t xml:space="preserve">Mon Oct 12</w:t>
             </w:r>
           </w:p>
         </w:tc>
@@ -1495,7 +1495,7 @@
               <w:t xml:space="preserve"> </w:t>
             </w:r>
             <w:r>
-              <w:t xml:space="preserve">Announcement post. All-hands 1.</w:t>
+              <w:t xml:space="preserve">Announcement post. One post in each of Uram Care's school chapter groups.</w:t>
             </w:r>
           </w:p>
         </w:tc>
@@ -1519,7 +1519,7 @@
               <w:pStyle w:val="Compact"/>
             </w:pPr>
             <w:r>
-              <w:t xml:space="preserve">Mon Oct 13</w:t>
+              <w:t xml:space="preserve">Tue Oct 13</w:t>
             </w:r>
           </w:p>
         </w:tc>
@@ -1614,7 +1614,7 @@
               <w:pStyle w:val="Compact"/>
             </w:pPr>
             <w:r>
-              <w:t xml:space="preserve">Tue Oct 14</w:t>
+              <w:t xml:space="preserve">Wed Oct 14</w:t>
             </w:r>
           </w:p>
         </w:tc>
@@ -1659,7 +1659,7 @@
               <w:pStyle w:val="Compact"/>
             </w:pPr>
             <w:r>
-              <w:t xml:space="preserve">Wed Oct 15</w:t>
+              <w:t xml:space="preserve">Thu Oct 15</w:t>
             </w:r>
           </w:p>
         </w:tc>
@@ -1694,7 +1694,7 @@
               <w:pStyle w:val="Compact"/>
             </w:pPr>
             <w:r>
-              <w:t xml:space="preserve">Thu Oct 16</w:t>
+              <w:t xml:space="preserve">Fri Oct 16</w:t>
             </w:r>
           </w:p>
         </w:tc>
@@ -1729,7 +1729,7 @@
               <w:pStyle w:val="Compact"/>
             </w:pPr>
             <w:r>
-              <w:t xml:space="preserve">Fri Oct 17</w:t>
+              <w:t xml:space="preserve">Sat Oct 17</w:t>
             </w:r>
           </w:p>
         </w:tc>
@@ -1764,7 +1764,7 @@
               <w:pStyle w:val="Compact"/>
             </w:pPr>
             <w:r>
-              <w:t xml:space="preserve">Sat Oct 18</w:t>
+              <w:t xml:space="preserve">Sun Oct 18</w:t>
             </w:r>
           </w:p>
         </w:tc>
@@ -1799,7 +1799,7 @@
               <w:pStyle w:val="Compact"/>
             </w:pPr>
             <w:r>
-              <w:t xml:space="preserve">Sun Oct 19</w:t>
+              <w:t xml:space="preserve">Sun Oct 18</w:t>
             </w:r>
           </w:p>
         </w:tc>
@@ -1834,7 +1834,7 @@
               <w:pStyle w:val="Compact"/>
             </w:pPr>
             <w:r>
-              <w:t xml:space="preserve">Mon Oct 20</w:t>
+              <w:t xml:space="preserve">Tue Oct 20</w:t>
             </w:r>
           </w:p>
         </w:tc>
@@ -1929,7 +1929,7 @@
               <w:pStyle w:val="Compact"/>
             </w:pPr>
             <w:r>
-              <w:t xml:space="preserve">Tue Oct 21</w:t>
+              <w:t xml:space="preserve">Wed Oct 21</w:t>
             </w:r>
           </w:p>
         </w:tc>
@@ -1964,7 +1964,7 @@
               <w:pStyle w:val="Compact"/>
             </w:pPr>
             <w:r>
-              <w:t xml:space="preserve">Wed Oct 22</w:t>
+              <w:t xml:space="preserve">Thu Oct 22</w:t>
             </w:r>
           </w:p>
         </w:tc>
@@ -1999,7 +1999,7 @@
               <w:pStyle w:val="Compact"/>
             </w:pPr>
             <w:r>
-              <w:t xml:space="preserve">Thu Oct 23</w:t>
+              <w:t xml:space="preserve">Fri Oct 23</w:t>
             </w:r>
           </w:p>
         </w:tc>
@@ -2034,7 +2034,7 @@
               <w:pStyle w:val="Compact"/>
             </w:pPr>
             <w:r>
-              <w:t xml:space="preserve">Fri Oct 24</w:t>
+              <w:t xml:space="preserve">Sat Oct 24</w:t>
             </w:r>
           </w:p>
         </w:tc>
@@ -2069,7 +2069,7 @@
               <w:pStyle w:val="Compact"/>
             </w:pPr>
             <w:r>
-              <w:t xml:space="preserve">Sat Oct 25</w:t>
+              <w:t xml:space="preserve">Sun Oct 25</w:t>
             </w:r>
           </w:p>
         </w:tc>
@@ -2114,18 +2114,18 @@
               <w:pStyle w:val="Compact"/>
             </w:pPr>
             <w:r>
-              <w:t xml:space="preserve">Sun Oct 26</w:t>
-            </w:r>
-          </w:p>
-        </w:tc>
-        <w:tc>
-          <w:tcPr/>
-          <w:p>
-            <w:pPr>
-              <w:pStyle w:val="Compact"/>
-            </w:pPr>
-            <w:r>
-              <w:t xml:space="preserve">All-hands 3.</w:t>
+              <w:t xml:space="preserve">Sun Oct 25</w:t>
+            </w:r>
+          </w:p>
+        </w:tc>
+        <w:tc>
+          <w:tcPr/>
+          <w:p>
+            <w:pPr>
+              <w:pStyle w:val="Compact"/>
+            </w:pPr>
+            <w:r>
+              <w:t xml:space="preserve">All-hands 3, same evening as the money gate.</w:t>
             </w:r>
           </w:p>
         </w:tc>
@@ -2149,7 +2149,7 @@
               <w:pStyle w:val="Compact"/>
             </w:pPr>
             <w:r>
-              <w:t xml:space="preserve">Mon Oct 27</w:t>
+              <w:t xml:space="preserve">Tue Oct 27</w:t>
             </w:r>
           </w:p>
         </w:tc>
@@ -2254,7 +2254,7 @@
               <w:pStyle w:val="Compact"/>
             </w:pPr>
             <w:r>
-              <w:t xml:space="preserve">Tue Oct 28</w:t>
+              <w:t xml:space="preserve">Wed Oct 28</w:t>
             </w:r>
           </w:p>
         </w:tc>
@@ -2299,7 +2299,7 @@
               <w:pStyle w:val="Compact"/>
             </w:pPr>
             <w:r>
-              <w:t xml:space="preserve">Wed Oct 29</w:t>
+              <w:t xml:space="preserve">Thu Oct 29</w:t>
             </w:r>
           </w:p>
         </w:tc>
@@ -2334,7 +2334,7 @@
               <w:pStyle w:val="Compact"/>
             </w:pPr>
             <w:r>
-              <w:t xml:space="preserve">Thu Oct 30</w:t>
+              <w:t xml:space="preserve">Fri Oct 30</w:t>
             </w:r>
           </w:p>
         </w:tc>
@@ -2376,7 +2376,7 @@
               <w:pStyle w:val="Compact"/>
             </w:pPr>
             <w:r>
-              <w:t xml:space="preserve">Fri Oct 31</w:t>
+              <w:t xml:space="preserve">Sat Oct 31</w:t>
             </w:r>
           </w:p>
         </w:tc>
@@ -2411,42 +2411,42 @@
               <w:pStyle w:val="Compact"/>
             </w:pPr>
             <w:r>
-              <w:t xml:space="preserve">Sat Nov 1</w:t>
-            </w:r>
-          </w:p>
-        </w:tc>
-        <w:tc>
-          <w:tcPr/>
-          <w:p>
-            <w:pPr>
-              <w:pStyle w:val="Compact"/>
-            </w:pPr>
-            <w:r>
-              <w:t xml:space="preserve">Reconfirmation message to all registrants: reply to keep your seat.</w:t>
-            </w:r>
-          </w:p>
-        </w:tc>
-        <w:tc>
-          <w:tcPr/>
-          <w:p>
-            <w:pPr>
-              <w:pStyle w:val="Compact"/>
-            </w:pPr>
-            <w:r>
-              <w:t xml:space="preserve">K</w:t>
-            </w:r>
-          </w:p>
-        </w:tc>
-      </w:tr>
-      <w:tr>
-        <w:tc>
-          <w:tcPr/>
-          <w:p>
-            <w:pPr>
-              <w:pStyle w:val="Compact"/>
-            </w:pPr>
-            <w:r>
-              <w:t xml:space="preserve">Sun Nov 2</w:t>
+              <w:t xml:space="preserve">Sun Nov 1</w:t>
+            </w:r>
+          </w:p>
+        </w:tc>
+        <w:tc>
+          <w:tcPr/>
+          <w:p>
+            <w:pPr>
+              <w:pStyle w:val="Compact"/>
+            </w:pPr>
+            <w:r>
+              <w:t xml:space="preserve">Reconfirmation message to all registrants: reply to keep your seat. All-hands 4.</w:t>
+            </w:r>
+          </w:p>
+        </w:tc>
+        <w:tc>
+          <w:tcPr/>
+          <w:p>
+            <w:pPr>
+              <w:pStyle w:val="Compact"/>
+            </w:pPr>
+            <w:r>
+              <w:t xml:space="preserve">K, M</w:t>
+            </w:r>
+          </w:p>
+        </w:tc>
+      </w:tr>
+      <w:tr>
+        <w:tc>
+          <w:tcPr/>
+          <w:p>
+            <w:pPr>
+              <w:pStyle w:val="Compact"/>
+            </w:pPr>
+            <w:r>
+              <w:t xml:space="preserve">Mon Nov 2</w:t>
             </w:r>
           </w:p>
         </w:tc>
@@ -2491,7 +2491,7 @@
               <w:pStyle w:val="Compact"/>
             </w:pPr>
             <w:r>
-              <w:t xml:space="preserve">Mon Nov 3</w:t>
+              <w:t xml:space="preserve">Tue Nov 3</w:t>
             </w:r>
           </w:p>
         </w:tc>

</xml_diff>